<commit_message>
docs(v2.0.2.1): finalize STEP 08 authorization DOCX
</commit_message>
<xml_diff>
--- a/docs/v2_0_2_1_planning/docx/08_V2_0.2.1_SOURCE_OF_TRUTH_SYNC_AND_IMPLEMENTATION_AUTHORIZATION.docx
+++ b/docs/v2_0_2_1_planning/docx/08_V2_0.2.1_SOURCE_OF_TRUTH_SYNC_AND_IMPLEMENTATION_AUTHORIZATION.docx
@@ -3468,7 +3468,7 @@
               <w:rPr>
                 <w:sz w:val="13"/>
               </w:rPr>
-              <w:t>PENDING during STEP 08 execution</w:t>
+              <w:t>PASS</w:t>
             </w:r>
           </w:p>
         </w:tc>
@@ -3508,7 +3508,7 @@
               <w:rPr>
                 <w:sz w:val="13"/>
               </w:rPr>
-              <w:t>PENDING during STEP 08 execution</w:t>
+              <w:t>PASS</w:t>
             </w:r>
           </w:p>
         </w:tc>
@@ -3548,7 +3548,7 @@
               <w:rPr>
                 <w:sz w:val="13"/>
               </w:rPr>
-              <w:t>PENDING during STEP 08 execution</w:t>
+              <w:t>PASS</w:t>
             </w:r>
           </w:p>
         </w:tc>
@@ -3668,7 +3668,7 @@
               <w:rPr>
                 <w:sz w:val="13"/>
               </w:rPr>
-              <w:t>CONDITIONAL until sync verification completes</w:t>
+              <w:t>PASS — K0 AUTHORIZED</w:t>
             </w:r>
           </w:p>
         </w:tc>
@@ -4648,7 +4648,7 @@
               <w:rPr>
                 <w:sz w:val="14"/>
               </w:rPr>
-              <w:t>PASS if all sync verification succeeds</w:t>
+              <w:t>PASS — synchronization verified; K0 AUTHORIZED</w:t>
             </w:r>
           </w:p>
         </w:tc>

</xml_diff>